<commit_message>
feat(about): overhaul leadership, governance, and architecture team profiles
</commit_message>
<xml_diff>
--- a/docs/AURA Official Website Structure & Content Architecture.docx
+++ b/docs/AURA Official Website Structure & Content Architecture.docx
@@ -408,14 +408,14 @@
         <w:rPr/>
         <w:drawing>
           <wp:inline distB="114300" distT="114300" distL="114300" distR="114300">
-            <wp:extent cx="4467225" cy="2247900"/>
+            <wp:extent cx="4467225" cy="2605088"/>
             <wp:effectExtent b="0" l="0" r="0" t="0"/>
-            <wp:docPr id="8" name="image6.png"/>
+            <wp:docPr id="8" name="image7.png"/>
             <a:graphic>
               <a:graphicData uri="http://schemas.openxmlformats.org/drawingml/2006/picture">
                 <pic:pic>
                   <pic:nvPicPr>
-                    <pic:cNvPr id="0" name="image6.png"/>
+                    <pic:cNvPr id="0" name="image7.png"/>
                     <pic:cNvPicPr preferRelativeResize="0"/>
                   </pic:nvPicPr>
                   <pic:blipFill>
@@ -428,7 +428,7 @@
                   <pic:spPr>
                     <a:xfrm>
                       <a:off x="0" y="0"/>
-                      <a:ext cx="4467225" cy="2247900"/>
+                      <a:ext cx="4467225" cy="2605088"/>
                     </a:xfrm>
                     <a:prstGeom prst="rect"/>
                     <a:ln/>
@@ -3089,262 +3089,582 @@
         <w:rPr/>
       </w:pPr>
       <w:r>
-        <w:rPr/>
-        <w:drawing>
-          <wp:inline distB="114300" distT="114300" distL="114300" distR="114300">
-            <wp:extent cx="2284853" cy="2871788"/>
-            <wp:effectExtent b="0" l="0" r="0" t="0"/>
-            <wp:docPr id="1" name="image7.jpg"/>
-            <a:graphic>
-              <a:graphicData uri="http://schemas.openxmlformats.org/drawingml/2006/picture">
-                <pic:pic>
-                  <pic:nvPicPr>
-                    <pic:cNvPr id="0" name="image7.jpg"/>
-                    <pic:cNvPicPr preferRelativeResize="0"/>
-                  </pic:nvPicPr>
-                  <pic:blipFill>
-                    <a:blip r:embed="rId7"/>
-                    <a:srcRect b="7953" l="0" r="0" t="0"/>
-                    <a:stretch>
-                      <a:fillRect/>
-                    </a:stretch>
-                  </pic:blipFill>
-                  <pic:spPr>
-                    <a:xfrm>
-                      <a:off x="0" y="0"/>
-                      <a:ext cx="2284853" cy="2871788"/>
-                    </a:xfrm>
-                    <a:prstGeom prst="rect"/>
-                    <a:ln/>
-                  </pic:spPr>
-                </pic:pic>
-              </a:graphicData>
-            </a:graphic>
-          </wp:inline>
-        </w:drawing>
-      </w:r>
-      <w:r>
-        <w:rPr/>
-        <w:drawing>
-          <wp:inline distB="114300" distT="114300" distL="114300" distR="114300">
-            <wp:extent cx="2300288" cy="2900702"/>
-            <wp:effectExtent b="0" l="0" r="0" t="0"/>
-            <wp:docPr id="4" name="image5.jpg"/>
-            <a:graphic>
-              <a:graphicData uri="http://schemas.openxmlformats.org/drawingml/2006/picture">
-                <pic:pic>
-                  <pic:nvPicPr>
-                    <pic:cNvPr id="0" name="image5.jpg"/>
-                    <pic:cNvPicPr preferRelativeResize="0"/>
-                  </pic:nvPicPr>
-                  <pic:blipFill>
-                    <a:blip r:embed="rId8"/>
-                    <a:srcRect b="0" l="0" r="0" t="0"/>
-                    <a:stretch>
-                      <a:fillRect/>
-                    </a:stretch>
-                  </pic:blipFill>
-                  <pic:spPr>
-                    <a:xfrm>
-                      <a:off x="0" y="0"/>
-                      <a:ext cx="2300288" cy="2900702"/>
-                    </a:xfrm>
-                    <a:prstGeom prst="rect"/>
-                    <a:ln/>
-                  </pic:spPr>
-                </pic:pic>
-              </a:graphicData>
-            </a:graphic>
-          </wp:inline>
-        </w:drawing>
-      </w:r>
-      <w:r>
-        <w:rPr>
-          <w:b w:val="1"/>
-          <w:bCs w:val="1"/>
-          <w:color w:val="1565c0"/>
-          <w:sz w:val="32"/>
-          <w:szCs w:val="32"/>
-        </w:rPr>
-        <w:drawing>
-          <wp:inline distB="114300" distT="114300" distL="114300" distR="114300">
-            <wp:extent cx="2573284" cy="2862263"/>
-            <wp:effectExtent b="0" l="0" r="0" t="0"/>
-            <wp:docPr id="7" name="image4.png"/>
-            <a:graphic>
-              <a:graphicData uri="http://schemas.openxmlformats.org/drawingml/2006/picture">
-                <pic:pic>
-                  <pic:nvPicPr>
-                    <pic:cNvPr id="0" name="image4.png"/>
-                    <pic:cNvPicPr preferRelativeResize="0"/>
-                  </pic:nvPicPr>
-                  <pic:blipFill>
-                    <a:blip r:embed="rId9"/>
-                    <a:srcRect b="0" l="6090" r="4006" t="0"/>
-                    <a:stretch>
-                      <a:fillRect/>
-                    </a:stretch>
-                  </pic:blipFill>
-                  <pic:spPr>
-                    <a:xfrm>
-                      <a:off x="0" y="0"/>
-                      <a:ext cx="2573284" cy="2862263"/>
-                    </a:xfrm>
-                    <a:prstGeom prst="rect"/>
-                    <a:ln/>
-                  </pic:spPr>
-                </pic:pic>
-              </a:graphicData>
-            </a:graphic>
-          </wp:inline>
-        </w:drawing>
-      </w:r>
-      <w:r>
-        <w:rPr/>
-        <w:drawing>
-          <wp:inline distB="114300" distT="114300" distL="114300" distR="114300">
-            <wp:extent cx="2386192" cy="2690813"/>
-            <wp:effectExtent b="0" l="0" r="0" t="0"/>
-            <wp:docPr id="3" name="image3.png"/>
-            <a:graphic>
-              <a:graphicData uri="http://schemas.openxmlformats.org/drawingml/2006/picture">
-                <pic:pic>
-                  <pic:nvPicPr>
-                    <pic:cNvPr id="0" name="image3.png"/>
-                    <pic:cNvPicPr preferRelativeResize="0"/>
-                  </pic:nvPicPr>
-                  <pic:blipFill>
-                    <a:blip r:embed="rId10"/>
-                    <a:srcRect b="0" l="0" r="0" t="0"/>
-                    <a:stretch>
-                      <a:fillRect/>
-                    </a:stretch>
-                  </pic:blipFill>
-                  <pic:spPr>
-                    <a:xfrm>
-                      <a:off x="0" y="0"/>
-                      <a:ext cx="2386192" cy="2690813"/>
-                    </a:xfrm>
-                    <a:prstGeom prst="rect"/>
-                    <a:ln/>
-                  </pic:spPr>
-                </pic:pic>
-              </a:graphicData>
-            </a:graphic>
-          </wp:inline>
-        </w:drawing>
-      </w:r>
-      <w:r>
-        <w:rPr/>
-        <w:drawing>
-          <wp:inline distB="114300" distT="114300" distL="114300" distR="114300">
-            <wp:extent cx="2305501" cy="2681288"/>
-            <wp:effectExtent b="0" l="0" r="0" t="0"/>
-            <wp:docPr id="6" name="image9.jpg"/>
-            <a:graphic>
-              <a:graphicData uri="http://schemas.openxmlformats.org/drawingml/2006/picture">
-                <pic:pic>
-                  <pic:nvPicPr>
-                    <pic:cNvPr id="0" name="image9.jpg"/>
-                    <pic:cNvPicPr preferRelativeResize="0"/>
-                  </pic:nvPicPr>
-                  <pic:blipFill>
-                    <a:blip r:embed="rId11"/>
-                    <a:srcRect b="7091" l="3365" r="3526" t="11538"/>
-                    <a:stretch>
-                      <a:fillRect/>
-                    </a:stretch>
-                  </pic:blipFill>
-                  <pic:spPr>
-                    <a:xfrm>
-                      <a:off x="0" y="0"/>
-                      <a:ext cx="2305501" cy="2681288"/>
-                    </a:xfrm>
-                    <a:prstGeom prst="rect"/>
-                    <a:ln/>
-                  </pic:spPr>
-                </pic:pic>
-              </a:graphicData>
-            </a:graphic>
-          </wp:inline>
-        </w:drawing>
-      </w:r>
-      <w:r>
-        <w:rPr/>
-        <w:drawing>
-          <wp:inline distB="114300" distT="114300" distL="114300" distR="114300">
-            <wp:extent cx="2162175" cy="2819400"/>
-            <wp:effectExtent b="0" l="0" r="0" t="0"/>
-            <wp:docPr id="9" name="image8.jpg"/>
-            <a:graphic>
-              <a:graphicData uri="http://schemas.openxmlformats.org/drawingml/2006/picture">
-                <pic:pic>
-                  <pic:nvPicPr>
-                    <pic:cNvPr id="0" name="image8.jpg"/>
-                    <pic:cNvPicPr preferRelativeResize="0"/>
-                  </pic:nvPicPr>
-                  <pic:blipFill>
-                    <a:blip r:embed="rId12"/>
-                    <a:srcRect b="12684" l="0" r="0" t="0"/>
-                    <a:stretch>
-                      <a:fillRect/>
-                    </a:stretch>
-                  </pic:blipFill>
-                  <pic:spPr>
-                    <a:xfrm>
-                      <a:off x="0" y="0"/>
-                      <a:ext cx="2162175" cy="2819400"/>
-                    </a:xfrm>
-                    <a:prstGeom prst="rect"/>
-                    <a:ln/>
-                  </pic:spPr>
-                </pic:pic>
-              </a:graphicData>
-            </a:graphic>
-          </wp:inline>
-        </w:drawing>
-      </w:r>
-      <w:r>
-        <w:rPr/>
-        <w:drawing>
-          <wp:inline distB="114300" distT="114300" distL="114300" distR="114300">
-            <wp:extent cx="2309813" cy="2309813"/>
-            <wp:effectExtent b="0" l="0" r="0" t="0"/>
-            <wp:docPr id="2" name="image1.jpg"/>
-            <a:graphic>
-              <a:graphicData uri="http://schemas.openxmlformats.org/drawingml/2006/picture">
-                <pic:pic>
-                  <pic:nvPicPr>
-                    <pic:cNvPr id="0" name="image1.jpg"/>
-                    <pic:cNvPicPr preferRelativeResize="0"/>
-                  </pic:nvPicPr>
-                  <pic:blipFill>
-                    <a:blip r:embed="rId13"/>
-                    <a:srcRect b="0" l="0" r="0" t="0"/>
-                    <a:stretch>
-                      <a:fillRect/>
-                    </a:stretch>
-                  </pic:blipFill>
-                  <pic:spPr>
-                    <a:xfrm>
-                      <a:off x="0" y="0"/>
-                      <a:ext cx="2309813" cy="2309813"/>
-                    </a:xfrm>
-                    <a:prstGeom prst="rect"/>
-                    <a:ln/>
-                  </pic:spPr>
-                </pic:pic>
-              </a:graphicData>
-            </a:graphic>
-          </wp:inline>
-        </w:drawing>
-      </w:r>
-      <w:r>
-        <w:rPr>
-          <w:rtl w:val="0"/>
-        </w:rPr>
-      </w:r>
-    </w:p>
+        <w:rPr>
+          <w:rtl w:val="0"/>
+        </w:rPr>
+      </w:r>
+    </w:p>
+    <w:tbl>
+      <w:tblPr>
+        <w:tblStyle w:val="Table4"/>
+        <w:tblW w:w="9360.0" w:type="dxa"/>
+        <w:jc w:val="left"/>
+        <w:tblBorders>
+          <w:top w:color="000000" w:space="0" w:sz="8" w:val="single"/>
+          <w:left w:color="000000" w:space="0" w:sz="8" w:val="single"/>
+          <w:bottom w:color="000000" w:space="0" w:sz="8" w:val="single"/>
+          <w:right w:color="000000" w:space="0" w:sz="8" w:val="single"/>
+          <w:insideH w:color="000000" w:space="0" w:sz="8" w:val="single"/>
+          <w:insideV w:color="000000" w:space="0" w:sz="8" w:val="single"/>
+        </w:tblBorders>
+        <w:tblLayout w:type="fixed"/>
+        <w:tblLook w:val="0600"/>
+      </w:tblPr>
+      <w:tblGrid>
+        <w:gridCol w:w="4680"/>
+        <w:gridCol w:w="4680"/>
+        <w:tblGridChange w:id="0">
+          <w:tblGrid>
+            <w:gridCol w:w="4680"/>
+            <w:gridCol w:w="4680"/>
+          </w:tblGrid>
+        </w:tblGridChange>
+      </w:tblGrid>
+      <w:tr>
+        <w:trPr>
+          <w:cantSplit w:val="0"/>
+          <w:tblHeader w:val="0"/>
+        </w:trPr>
+        <w:tc>
+          <w:tcPr/>
+          <w:p>
+            <w:pPr>
+              <w:rPr/>
+            </w:pPr>
+            <w:r>
+              <w:rPr/>
+              <w:drawing>
+                <wp:inline distB="114300" distT="114300" distL="114300" distR="114300">
+                  <wp:extent cx="2284853" cy="2871788"/>
+                  <wp:effectExtent b="0" l="0" r="0" t="0"/>
+                  <wp:docPr id="5" name="image9.jpg"/>
+                  <a:graphic>
+                    <a:graphicData uri="http://schemas.openxmlformats.org/drawingml/2006/picture">
+                      <pic:pic>
+                        <pic:nvPicPr>
+                          <pic:cNvPr id="0" name="image9.jpg"/>
+                          <pic:cNvPicPr preferRelativeResize="0"/>
+                        </pic:nvPicPr>
+                        <pic:blipFill>
+                          <a:blip r:embed="rId7"/>
+                          <a:srcRect b="7953" l="0" r="0" t="0"/>
+                          <a:stretch>
+                            <a:fillRect/>
+                          </a:stretch>
+                        </pic:blipFill>
+                        <pic:spPr>
+                          <a:xfrm>
+                            <a:off x="0" y="0"/>
+                            <a:ext cx="2284853" cy="2871788"/>
+                          </a:xfrm>
+                          <a:prstGeom prst="rect"/>
+                          <a:ln/>
+                        </pic:spPr>
+                      </pic:pic>
+                    </a:graphicData>
+                  </a:graphic>
+                </wp:inline>
+              </w:drawing>
+            </w:r>
+            <w:r>
+              <w:rPr>
+                <w:rtl w:val="0"/>
+              </w:rPr>
+            </w:r>
+          </w:p>
+        </w:tc>
+        <w:tc>
+          <w:tcPr/>
+          <w:p>
+            <w:pPr>
+              <w:rPr/>
+            </w:pPr>
+            <w:r>
+              <w:rPr>
+                <w:rtl w:val="0"/>
+              </w:rPr>
+              <w:t xml:space="preserve">[Name/Title Placeholder]</w:t>
+            </w:r>
+          </w:p>
+        </w:tc>
+      </w:tr>
+      <w:tr>
+        <w:trPr>
+          <w:cantSplit w:val="0"/>
+          <w:tblHeader w:val="0"/>
+        </w:trPr>
+        <w:tc>
+          <w:tcPr/>
+          <w:p>
+            <w:pPr>
+              <w:rPr/>
+            </w:pPr>
+            <w:r>
+              <w:rPr/>
+              <w:drawing>
+                <wp:inline distB="114300" distT="114300" distL="114300" distR="114300">
+                  <wp:extent cx="2300288" cy="2900702"/>
+                  <wp:effectExtent b="0" l="0" r="0" t="0"/>
+                  <wp:docPr id="1" name="image4.jpg"/>
+                  <a:graphic>
+                    <a:graphicData uri="http://schemas.openxmlformats.org/drawingml/2006/picture">
+                      <pic:pic>
+                        <pic:nvPicPr>
+                          <pic:cNvPr id="0" name="image4.jpg"/>
+                          <pic:cNvPicPr preferRelativeResize="0"/>
+                        </pic:nvPicPr>
+                        <pic:blipFill>
+                          <a:blip r:embed="rId8"/>
+                          <a:srcRect b="0" l="0" r="0" t="0"/>
+                          <a:stretch>
+                            <a:fillRect/>
+                          </a:stretch>
+                        </pic:blipFill>
+                        <pic:spPr>
+                          <a:xfrm>
+                            <a:off x="0" y="0"/>
+                            <a:ext cx="2300288" cy="2900702"/>
+                          </a:xfrm>
+                          <a:prstGeom prst="rect"/>
+                          <a:ln/>
+                        </pic:spPr>
+                      </pic:pic>
+                    </a:graphicData>
+                  </a:graphic>
+                </wp:inline>
+              </w:drawing>
+            </w:r>
+            <w:r>
+              <w:rPr>
+                <w:rtl w:val="0"/>
+              </w:rPr>
+            </w:r>
+          </w:p>
+        </w:tc>
+        <w:tc>
+          <w:tcPr/>
+          <w:p>
+            <w:pPr>
+              <w:rPr/>
+            </w:pPr>
+            <w:r>
+              <w:rPr>
+                <w:rtl w:val="0"/>
+              </w:rPr>
+              <w:t xml:space="preserve">[Name/Title Placeholder]</w:t>
+            </w:r>
+          </w:p>
+        </w:tc>
+      </w:tr>
+      <w:tr>
+        <w:trPr>
+          <w:cantSplit w:val="0"/>
+          <w:tblHeader w:val="0"/>
+        </w:trPr>
+        <w:tc>
+          <w:tcPr/>
+          <w:p>
+            <w:pPr>
+              <w:rPr/>
+            </w:pPr>
+            <w:r>
+              <w:rPr/>
+              <w:drawing>
+                <wp:inline distB="114300" distT="114300" distL="114300" distR="114300">
+                  <wp:extent cx="2573284" cy="2862263"/>
+                  <wp:effectExtent b="0" l="0" r="0" t="0"/>
+                  <wp:docPr id="2" name="image2.png"/>
+                  <a:graphic>
+                    <a:graphicData uri="http://schemas.openxmlformats.org/drawingml/2006/picture">
+                      <pic:pic>
+                        <pic:nvPicPr>
+                          <pic:cNvPr id="0" name="image2.png"/>
+                          <pic:cNvPicPr preferRelativeResize="0"/>
+                        </pic:nvPicPr>
+                        <pic:blipFill>
+                          <a:blip r:embed="rId9"/>
+                          <a:srcRect b="0" l="6090" r="4006" t="0"/>
+                          <a:stretch>
+                            <a:fillRect/>
+                          </a:stretch>
+                        </pic:blipFill>
+                        <pic:spPr>
+                          <a:xfrm>
+                            <a:off x="0" y="0"/>
+                            <a:ext cx="2573284" cy="2862263"/>
+                          </a:xfrm>
+                          <a:prstGeom prst="rect"/>
+                          <a:ln/>
+                        </pic:spPr>
+                      </pic:pic>
+                    </a:graphicData>
+                  </a:graphic>
+                </wp:inline>
+              </w:drawing>
+            </w:r>
+            <w:r>
+              <w:rPr>
+                <w:rtl w:val="0"/>
+              </w:rPr>
+            </w:r>
+          </w:p>
+        </w:tc>
+        <w:tc>
+          <w:tcPr/>
+          <w:p>
+            <w:pPr>
+              <w:rPr/>
+            </w:pPr>
+            <w:r>
+              <w:rPr>
+                <w:rtl w:val="0"/>
+              </w:rPr>
+              <w:t xml:space="preserve">[Name/Title Placeholder]</w:t>
+            </w:r>
+          </w:p>
+        </w:tc>
+      </w:tr>
+      <w:tr>
+        <w:trPr>
+          <w:cantSplit w:val="0"/>
+          <w:tblHeader w:val="0"/>
+        </w:trPr>
+        <w:tc>
+          <w:tcPr/>
+          <w:p>
+            <w:pPr>
+              <w:rPr/>
+            </w:pPr>
+            <w:r>
+              <w:rPr/>
+              <w:drawing>
+                <wp:inline distB="114300" distT="114300" distL="114300" distR="114300">
+                  <wp:extent cx="2386193" cy="2690813"/>
+                  <wp:effectExtent b="0" l="0" r="0" t="0"/>
+                  <wp:docPr id="4" name="image5.png"/>
+                  <a:graphic>
+                    <a:graphicData uri="http://schemas.openxmlformats.org/drawingml/2006/picture">
+                      <pic:pic>
+                        <pic:nvPicPr>
+                          <pic:cNvPr id="0" name="image5.png"/>
+                          <pic:cNvPicPr preferRelativeResize="0"/>
+                        </pic:nvPicPr>
+                        <pic:blipFill>
+                          <a:blip r:embed="rId10"/>
+                          <a:srcRect b="0" l="0" r="0" t="0"/>
+                          <a:stretch>
+                            <a:fillRect/>
+                          </a:stretch>
+                        </pic:blipFill>
+                        <pic:spPr>
+                          <a:xfrm>
+                            <a:off x="0" y="0"/>
+                            <a:ext cx="2386193" cy="2690813"/>
+                          </a:xfrm>
+                          <a:prstGeom prst="rect"/>
+                          <a:ln/>
+                        </pic:spPr>
+                      </pic:pic>
+                    </a:graphicData>
+                  </a:graphic>
+                </wp:inline>
+              </w:drawing>
+            </w:r>
+            <w:r>
+              <w:rPr>
+                <w:rtl w:val="0"/>
+              </w:rPr>
+            </w:r>
+          </w:p>
+        </w:tc>
+        <w:tc>
+          <w:tcPr/>
+          <w:p>
+            <w:pPr>
+              <w:rPr/>
+            </w:pPr>
+            <w:r>
+              <w:rPr>
+                <w:rtl w:val="0"/>
+              </w:rPr>
+              <w:t xml:space="preserve">[Name/Title Placeholder]</w:t>
+            </w:r>
+          </w:p>
+        </w:tc>
+      </w:tr>
+      <w:tr>
+        <w:trPr>
+          <w:cantSplit w:val="0"/>
+          <w:tblHeader w:val="0"/>
+        </w:trPr>
+        <w:tc>
+          <w:tcPr/>
+          <w:p>
+            <w:pPr>
+              <w:rPr/>
+            </w:pPr>
+            <w:r>
+              <w:rPr/>
+              <w:drawing>
+                <wp:inline distB="114300" distT="114300" distL="114300" distR="114300">
+                  <wp:extent cx="2305501" cy="2681288"/>
+                  <wp:effectExtent b="0" l="0" r="0" t="0"/>
+                  <wp:docPr id="3" name="image10.jpg"/>
+                  <a:graphic>
+                    <a:graphicData uri="http://schemas.openxmlformats.org/drawingml/2006/picture">
+                      <pic:pic>
+                        <pic:nvPicPr>
+                          <pic:cNvPr id="0" name="image10.jpg"/>
+                          <pic:cNvPicPr preferRelativeResize="0"/>
+                        </pic:nvPicPr>
+                        <pic:blipFill>
+                          <a:blip r:embed="rId11"/>
+                          <a:srcRect b="7091" l="3365" r="3526" t="11538"/>
+                          <a:stretch>
+                            <a:fillRect/>
+                          </a:stretch>
+                        </pic:blipFill>
+                        <pic:spPr>
+                          <a:xfrm>
+                            <a:off x="0" y="0"/>
+                            <a:ext cx="2305501" cy="2681288"/>
+                          </a:xfrm>
+                          <a:prstGeom prst="rect"/>
+                          <a:ln/>
+                        </pic:spPr>
+                      </pic:pic>
+                    </a:graphicData>
+                  </a:graphic>
+                </wp:inline>
+              </w:drawing>
+            </w:r>
+            <w:r>
+              <w:rPr>
+                <w:rtl w:val="0"/>
+              </w:rPr>
+            </w:r>
+          </w:p>
+        </w:tc>
+        <w:tc>
+          <w:tcPr/>
+          <w:p>
+            <w:pPr>
+              <w:rPr/>
+            </w:pPr>
+            <w:r>
+              <w:rPr>
+                <w:rtl w:val="0"/>
+              </w:rPr>
+              <w:t xml:space="preserve">[Name/Title Placeholder]</w:t>
+            </w:r>
+          </w:p>
+        </w:tc>
+      </w:tr>
+      <w:tr>
+        <w:trPr>
+          <w:cantSplit w:val="0"/>
+          <w:tblHeader w:val="0"/>
+        </w:trPr>
+        <w:tc>
+          <w:tcPr/>
+          <w:p>
+            <w:pPr>
+              <w:rPr/>
+            </w:pPr>
+            <w:r>
+              <w:rPr/>
+              <w:drawing>
+                <wp:inline distB="114300" distT="114300" distL="114300" distR="114300">
+                  <wp:extent cx="2162175" cy="2819400"/>
+                  <wp:effectExtent b="0" l="0" r="0" t="0"/>
+                  <wp:docPr id="10" name="image8.jpg"/>
+                  <a:graphic>
+                    <a:graphicData uri="http://schemas.openxmlformats.org/drawingml/2006/picture">
+                      <pic:pic>
+                        <pic:nvPicPr>
+                          <pic:cNvPr id="0" name="image8.jpg"/>
+                          <pic:cNvPicPr preferRelativeResize="0"/>
+                        </pic:nvPicPr>
+                        <pic:blipFill>
+                          <a:blip r:embed="rId12"/>
+                          <a:srcRect b="12684" l="0" r="0" t="0"/>
+                          <a:stretch>
+                            <a:fillRect/>
+                          </a:stretch>
+                        </pic:blipFill>
+                        <pic:spPr>
+                          <a:xfrm>
+                            <a:off x="0" y="0"/>
+                            <a:ext cx="2162175" cy="2819400"/>
+                          </a:xfrm>
+                          <a:prstGeom prst="rect"/>
+                          <a:ln/>
+                        </pic:spPr>
+                      </pic:pic>
+                    </a:graphicData>
+                  </a:graphic>
+                </wp:inline>
+              </w:drawing>
+            </w:r>
+            <w:r>
+              <w:rPr>
+                <w:rtl w:val="0"/>
+              </w:rPr>
+            </w:r>
+          </w:p>
+        </w:tc>
+        <w:tc>
+          <w:tcPr/>
+          <w:p>
+            <w:pPr>
+              <w:rPr/>
+            </w:pPr>
+            <w:r>
+              <w:rPr>
+                <w:rtl w:val="0"/>
+              </w:rPr>
+              <w:t xml:space="preserve">[Name/Title Placeholder]</w:t>
+            </w:r>
+          </w:p>
+        </w:tc>
+      </w:tr>
+      <w:tr>
+        <w:trPr>
+          <w:cantSplit w:val="0"/>
+          <w:tblHeader w:val="0"/>
+        </w:trPr>
+        <w:tc>
+          <w:tcPr/>
+          <w:p>
+            <w:pPr>
+              <w:rPr/>
+            </w:pPr>
+            <w:r>
+              <w:rPr/>
+              <w:drawing>
+                <wp:inline distB="114300" distT="114300" distL="114300" distR="114300">
+                  <wp:extent cx="2309813" cy="2309813"/>
+                  <wp:effectExtent b="0" l="0" r="0" t="0"/>
+                  <wp:docPr id="9" name="image1.jpg"/>
+                  <a:graphic>
+                    <a:graphicData uri="http://schemas.openxmlformats.org/drawingml/2006/picture">
+                      <pic:pic>
+                        <pic:nvPicPr>
+                          <pic:cNvPr id="0" name="image1.jpg"/>
+                          <pic:cNvPicPr preferRelativeResize="0"/>
+                        </pic:nvPicPr>
+                        <pic:blipFill>
+                          <a:blip r:embed="rId13"/>
+                          <a:srcRect b="0" l="0" r="0" t="0"/>
+                          <a:stretch>
+                            <a:fillRect/>
+                          </a:stretch>
+                        </pic:blipFill>
+                        <pic:spPr>
+                          <a:xfrm>
+                            <a:off x="0" y="0"/>
+                            <a:ext cx="2309813" cy="2309813"/>
+                          </a:xfrm>
+                          <a:prstGeom prst="rect"/>
+                          <a:ln/>
+                        </pic:spPr>
+                      </pic:pic>
+                    </a:graphicData>
+                  </a:graphic>
+                </wp:inline>
+              </w:drawing>
+            </w:r>
+            <w:r>
+              <w:rPr>
+                <w:rtl w:val="0"/>
+              </w:rPr>
+            </w:r>
+          </w:p>
+        </w:tc>
+        <w:tc>
+          <w:tcPr/>
+          <w:p>
+            <w:pPr>
+              <w:rPr/>
+            </w:pPr>
+            <w:r>
+              <w:rPr>
+                <w:rtl w:val="0"/>
+              </w:rPr>
+              <w:t xml:space="preserve">[Name/Title Placeholder]</w:t>
+            </w:r>
+          </w:p>
+        </w:tc>
+      </w:tr>
+      <w:tr>
+        <w:trPr>
+          <w:cantSplit w:val="0"/>
+          <w:tblHeader w:val="0"/>
+        </w:trPr>
+        <w:tc>
+          <w:tcPr/>
+          <w:p>
+            <w:pPr>
+              <w:rPr/>
+            </w:pPr>
+            <w:r>
+              <w:rPr/>
+              <w:drawing>
+                <wp:inline distB="114300" distT="114300" distL="114300" distR="114300">
+                  <wp:extent cx="1357313" cy="2137767"/>
+                  <wp:effectExtent b="0" l="0" r="0" t="0"/>
+                  <wp:docPr id="6" name="image6.png"/>
+                  <a:graphic>
+                    <a:graphicData uri="http://schemas.openxmlformats.org/drawingml/2006/picture">
+                      <pic:pic>
+                        <pic:nvPicPr>
+                          <pic:cNvPr id="0" name="image6.png"/>
+                          <pic:cNvPicPr preferRelativeResize="0"/>
+                        </pic:nvPicPr>
+                        <pic:blipFill>
+                          <a:blip r:embed="rId14"/>
+                          <a:srcRect b="0" l="0" r="0" t="0"/>
+                          <a:stretch>
+                            <a:fillRect/>
+                          </a:stretch>
+                        </pic:blipFill>
+                        <pic:spPr>
+                          <a:xfrm>
+                            <a:off x="0" y="0"/>
+                            <a:ext cx="1357313" cy="2137767"/>
+                          </a:xfrm>
+                          <a:prstGeom prst="rect"/>
+                          <a:ln/>
+                        </pic:spPr>
+                      </pic:pic>
+                    </a:graphicData>
+                  </a:graphic>
+                </wp:inline>
+              </w:drawing>
+            </w:r>
+            <w:r>
+              <w:rPr>
+                <w:rtl w:val="0"/>
+              </w:rPr>
+            </w:r>
+          </w:p>
+        </w:tc>
+        <w:tc>
+          <w:tcPr/>
+          <w:p>
+            <w:pPr>
+              <w:rPr/>
+            </w:pPr>
+            <w:r>
+              <w:rPr>
+                <w:rtl w:val="0"/>
+              </w:rPr>
+              <w:t xml:space="preserve">[Name/Title Placeholder]</w:t>
+            </w:r>
+          </w:p>
+        </w:tc>
+      </w:tr>
+    </w:tbl>
     <w:p>
       <w:pPr>
         <w:pStyle w:val="Heading2"/>
@@ -4403,7 +4723,7 @@
     </w:p>
     <w:tbl>
       <w:tblPr>
-        <w:tblStyle w:val="Table4"/>
+        <w:tblStyle w:val="Table5"/>
         <w:tblW w:w="9360.0" w:type="dxa"/>
         <w:jc w:val="left"/>
         <w:tblBorders>
@@ -5277,16 +5597,16 @@
           <wp:inline distB="114300" distT="114300" distL="114300" distR="114300">
             <wp:extent cx="5943600" cy="1892300"/>
             <wp:effectExtent b="0" l="0" r="0" t="0"/>
-            <wp:docPr id="5" name="image2.png"/>
+            <wp:docPr id="7" name="image3.png"/>
             <a:graphic>
               <a:graphicData uri="http://schemas.openxmlformats.org/drawingml/2006/picture">
                 <pic:pic>
                   <pic:nvPicPr>
-                    <pic:cNvPr id="0" name="image2.png"/>
+                    <pic:cNvPr id="0" name="image3.png"/>
                     <pic:cNvPicPr preferRelativeResize="0"/>
                   </pic:nvPicPr>
                   <pic:blipFill>
-                    <a:blip r:embed="rId14"/>
+                    <a:blip r:embed="rId15"/>
                     <a:srcRect b="0" l="0" r="0" t="0"/>
                     <a:stretch>
                       <a:fillRect/>
@@ -5337,7 +5657,7 @@
       </w:r>
     </w:p>
     <w:sectPr>
-      <w:headerReference r:id="rId15" w:type="default"/>
+      <w:headerReference r:id="rId16" w:type="default"/>
       <w:pgSz w:h="15840" w:w="12240" w:orient="portrait"/>
       <w:pgMar w:bottom="1440" w:top="1440" w:left="1440" w:right="1440" w:header="0" w:footer="720"/>
       <w:pgNumType w:start="1"/>
@@ -7486,6 +7806,13 @@
     </w:tblPr>
   </w:style>
   <w:style w:type="table" w:styleId="Table4">
+    <w:basedOn w:val="TableNormal"/>
+    <w:tblPr>
+      <w:tblStyleRowBandSize w:val="1"/>
+      <w:tblStyleColBandSize w:val="1"/>
+    </w:tblPr>
+  </w:style>
+  <w:style w:type="table" w:styleId="Table5">
     <w:basedOn w:val="TableNormal"/>
     <w:tblPr>
       <w:tblStyleRowBandSize w:val="1"/>

</xml_diff>